<commit_message>
Add API integration and data layer details to skills/projects
Reflects the multi-provider API abstraction and SQLite data layer
built in linkedin-network-intelligence.
</commit_message>
<xml_diff>
--- a/Mendy_Cohen_Resume_2026.docx
+++ b/Mendy_Cohen_Resume_2026.docx
@@ -784,6 +784,19 @@
     </w:p>
     <w:p>
       <w:pPr>
+        <w:pStyle w:val="ListBullet"/>
+        <w:spacing w:after="40" w:line="240" w:lineRule="auto"/>
+        <w:ind w:left="317"/>
+      </w:pPr>
+      <w:r>
+        <w:rPr>
+          <w:sz w:val="21"/>
+        </w:rPr>
+        <w:t>Designed a SQLite data layer to structure and query imported connection and message data, and built a multi-provider REST API integration layer (Claude, OpenAI, Gemini) to power the app's optional AI features</w:t>
+      </w:r>
+    </w:p>
+    <w:p>
+      <w:pPr>
         <w:spacing w:after="120"/>
         <w:ind w:left="317"/>
       </w:pPr>
@@ -835,7 +848,7 @@
         <w:rPr>
           <w:sz w:val="21"/>
         </w:rPr>
-        <w:t>Excel (Pivot Tables, Power Query), Power BI (Data Modeling, Visualization), SQL, Python, GitHub Actions/CI-CD, PowerPoint (Executive Presentations), Microsoft Copilot, Generative AI &amp; Agentic Workflow Design, Prompt Engineering, MCP (Model Context Protocol)</w:t>
+        <w:t>Excel (Pivot Tables, Power Query), Power BI (Data Modeling, Visualization), SQL, Python, REST API Integration, Relational Database Design, GitHub Actions/CI-CD, PowerPoint (Executive Presentations), Microsoft Copilot, Generative AI &amp; Agentic Workflow Design, Prompt Engineering, MCP (Model Context Protocol)</w:t>
       </w:r>
     </w:p>
     <w:p>

</xml_diff>